<commit_message>
Update PRD and add UI mockups
Update Specifications/PRD.docx and add UI/UX assets for design review. Added three mockups to Specifications/UIUX: Config Page.png, Runs Page.png, and Scripts Page.png to provide visual designs for the Config, Runs, and Scripts screens.
</commit_message>
<xml_diff>
--- a/Specifications/PRD.docx
+++ b/Specifications/PRD.docx
@@ -418,14 +418,12 @@
         <w:rPr>
           <w:b/>
           <w:bCs/>
-          <w:lang w:val="en-IL"/>
         </w:rPr>
       </w:pPr>
       <w:r>
         <w:rPr>
           <w:b/>
           <w:bCs/>
-          <w:lang w:val="en-IL"/>
         </w:rPr>
         <w:t>Namespaces</w:t>
       </w:r>
@@ -436,14 +434,8 @@
           <w:ilvl w:val="0"/>
           <w:numId w:val="32"/>
         </w:numPr>
-        <w:rPr>
-          <w:lang w:val="en-IL"/>
-        </w:rPr>
-      </w:pPr>
-      <w:r>
-        <w:rPr>
-          <w:lang w:val="en-IL"/>
-        </w:rPr>
+      </w:pPr>
+      <w:r>
         <w:t>Namespaces are named, folder-like containers used to organize resources and other namespaces.</w:t>
       </w:r>
     </w:p>
@@ -453,14 +445,8 @@
           <w:ilvl w:val="0"/>
           <w:numId w:val="32"/>
         </w:numPr>
-        <w:rPr>
-          <w:lang w:val="en-IL"/>
-        </w:rPr>
-      </w:pPr>
-      <w:r>
-        <w:rPr>
-          <w:lang w:val="en-IL"/>
-        </w:rPr>
+      </w:pPr>
+      <w:r>
         <w:t>For each Script or Config Item, the system creates a dedicated child Namespace (a “resource namespace”) that serves as its organizational container.</w:t>
       </w:r>
     </w:p>
@@ -470,14 +456,8 @@
           <w:ilvl w:val="0"/>
           <w:numId w:val="32"/>
         </w:numPr>
-        <w:rPr>
-          <w:lang w:val="en-IL"/>
-        </w:rPr>
-      </w:pPr>
-      <w:r>
-        <w:rPr>
-          <w:lang w:val="en-IL"/>
-        </w:rPr>
+      </w:pPr>
+      <w:r>
         <w:t>A Namespace may contain:</w:t>
       </w:r>
     </w:p>
@@ -487,14 +467,8 @@
           <w:ilvl w:val="1"/>
           <w:numId w:val="32"/>
         </w:numPr>
-        <w:rPr>
-          <w:lang w:val="en-IL"/>
-        </w:rPr>
-      </w:pPr>
-      <w:r>
-        <w:rPr>
-          <w:lang w:val="en-IL"/>
-        </w:rPr>
+      </w:pPr>
+      <w:r>
         <w:t>Sub-namespaces</w:t>
       </w:r>
     </w:p>
@@ -504,14 +478,8 @@
           <w:ilvl w:val="1"/>
           <w:numId w:val="32"/>
         </w:numPr>
-        <w:rPr>
-          <w:lang w:val="en-IL"/>
-        </w:rPr>
-      </w:pPr>
-      <w:r>
-        <w:rPr>
-          <w:lang w:val="en-IL"/>
-        </w:rPr>
+      </w:pPr>
+      <w:r>
         <w:t>Scripts</w:t>
       </w:r>
     </w:p>
@@ -521,14 +489,8 @@
           <w:ilvl w:val="1"/>
           <w:numId w:val="32"/>
         </w:numPr>
-        <w:rPr>
-          <w:lang w:val="en-IL"/>
-        </w:rPr>
-      </w:pPr>
-      <w:r>
-        <w:rPr>
-          <w:lang w:val="en-IL"/>
-        </w:rPr>
+      </w:pPr>
+      <w:r>
         <w:t>Config Items</w:t>
       </w:r>
     </w:p>
@@ -538,14 +500,8 @@
           <w:ilvl w:val="0"/>
           <w:numId w:val="32"/>
         </w:numPr>
-        <w:rPr>
-          <w:lang w:val="en-IL"/>
-        </w:rPr>
-      </w:pPr>
-      <w:r>
-        <w:rPr>
-          <w:lang w:val="en-IL"/>
-        </w:rPr>
+      </w:pPr>
+      <w:r>
         <w:t>Namespaces provide logical grouping and organizational boundaries.</w:t>
       </w:r>
     </w:p>
@@ -555,28 +511,18 @@
           <w:ilvl w:val="0"/>
           <w:numId w:val="32"/>
         </w:numPr>
-        <w:rPr>
-          <w:lang w:val="en-IL"/>
-        </w:rPr>
-      </w:pPr>
-      <w:r>
-        <w:rPr>
-          <w:lang w:val="en-IL"/>
-        </w:rPr>
+      </w:pPr>
+      <w:r>
         <w:t>Namespaces allow separation between different teams</w:t>
       </w:r>
       <w:r>
         <w:rPr>
           <w:rFonts w:hint="cs"/>
           <w:rtl/>
-          <w:lang w:val="en-IL"/>
         </w:rPr>
         <w:t xml:space="preserve"> </w:t>
       </w:r>
       <w:r>
-        <w:rPr>
-          <w:lang w:val="en-IL"/>
-        </w:rPr>
         <w:t>or environments.</w:t>
       </w:r>
     </w:p>
@@ -602,28 +548,18 @@
         <w:rPr>
           <w:b/>
           <w:bCs/>
-          <w:lang w:val="en-IL"/>
         </w:rPr>
       </w:pPr>
       <w:r>
         <w:rPr>
           <w:b/>
           <w:bCs/>
-          <w:lang w:val="en-IL"/>
         </w:rPr>
         <w:t>Roles</w:t>
       </w:r>
     </w:p>
     <w:p>
-      <w:pPr>
-        <w:rPr>
-          <w:lang w:val="en-IL"/>
-        </w:rPr>
-      </w:pPr>
-      <w:r>
-        <w:rPr>
-          <w:lang w:val="en-IL"/>
-        </w:rPr>
+      <w:r>
         <w:t>Developer</w:t>
       </w:r>
     </w:p>
@@ -633,14 +569,8 @@
           <w:ilvl w:val="0"/>
           <w:numId w:val="34"/>
         </w:numPr>
-        <w:rPr>
-          <w:lang w:val="en-IL"/>
-        </w:rPr>
-      </w:pPr>
-      <w:r>
-        <w:rPr>
-          <w:lang w:val="en-IL"/>
-        </w:rPr>
+      </w:pPr>
+      <w:r>
         <w:t>Can view namespaces and resources</w:t>
       </w:r>
     </w:p>
@@ -650,14 +580,8 @@
           <w:ilvl w:val="0"/>
           <w:numId w:val="34"/>
         </w:numPr>
-        <w:rPr>
-          <w:lang w:val="en-IL"/>
-        </w:rPr>
-      </w:pPr>
-      <w:r>
-        <w:rPr>
-          <w:lang w:val="en-IL"/>
-        </w:rPr>
+      </w:pPr>
+      <w:r>
         <w:t>Can execute scripts (based on permissions)</w:t>
       </w:r>
     </w:p>
@@ -667,14 +591,8 @@
           <w:ilvl w:val="0"/>
           <w:numId w:val="34"/>
         </w:numPr>
-        <w:rPr>
-          <w:lang w:val="en-IL"/>
-        </w:rPr>
-      </w:pPr>
-      <w:r>
-        <w:rPr>
-          <w:lang w:val="en-IL"/>
-        </w:rPr>
+      </w:pPr>
+      <w:r>
         <w:t>Can use configuration items (based on permissions)</w:t>
       </w:r>
     </w:p>
@@ -684,14 +602,8 @@
           <w:ilvl w:val="0"/>
           <w:numId w:val="34"/>
         </w:numPr>
-        <w:rPr>
-          <w:lang w:val="en-IL"/>
-        </w:rPr>
-      </w:pPr>
-      <w:r>
-        <w:rPr>
-          <w:lang w:val="en-IL"/>
-        </w:rPr>
+      </w:pPr>
+      <w:r>
         <w:t>Can create and edit namespaces</w:t>
       </w:r>
     </w:p>
@@ -701,27 +613,13 @@
           <w:ilvl w:val="0"/>
           <w:numId w:val="34"/>
         </w:numPr>
-        <w:rPr>
-          <w:lang w:val="en-IL"/>
-        </w:rPr>
-      </w:pPr>
-      <w:r>
-        <w:rPr>
-          <w:lang w:val="en-IL"/>
-        </w:rPr>
+      </w:pPr>
+      <w:r>
         <w:t>Can create, edit, and manage resources (based on permissions)</w:t>
       </w:r>
     </w:p>
     <w:p>
-      <w:pPr>
-        <w:rPr>
-          <w:lang w:val="en-IL"/>
-        </w:rPr>
-      </w:pPr>
-      <w:r>
-        <w:rPr>
-          <w:lang w:val="en-IL"/>
-        </w:rPr>
+      <w:r>
         <w:t>Runner</w:t>
       </w:r>
     </w:p>
@@ -731,14 +629,8 @@
           <w:ilvl w:val="0"/>
           <w:numId w:val="35"/>
         </w:numPr>
-        <w:rPr>
-          <w:lang w:val="en-IL"/>
-        </w:rPr>
-      </w:pPr>
-      <w:r>
-        <w:rPr>
-          <w:lang w:val="en-IL"/>
-        </w:rPr>
+      </w:pPr>
+      <w:r>
         <w:t>Can view namespaces</w:t>
       </w:r>
     </w:p>
@@ -748,14 +640,8 @@
           <w:ilvl w:val="0"/>
           <w:numId w:val="35"/>
         </w:numPr>
-        <w:rPr>
-          <w:lang w:val="en-IL"/>
-        </w:rPr>
-      </w:pPr>
-      <w:r>
-        <w:rPr>
-          <w:lang w:val="en-IL"/>
-        </w:rPr>
+      </w:pPr>
+      <w:r>
         <w:t>Can view and execute scripts (based on permissions)</w:t>
       </w:r>
     </w:p>
@@ -765,14 +651,8 @@
           <w:ilvl w:val="0"/>
           <w:numId w:val="35"/>
         </w:numPr>
-        <w:rPr>
-          <w:lang w:val="en-IL"/>
-        </w:rPr>
-      </w:pPr>
-      <w:r>
-        <w:rPr>
-          <w:lang w:val="en-IL"/>
-        </w:rPr>
+      </w:pPr>
+      <w:r>
         <w:t>Cannot create or edit scripts</w:t>
       </w:r>
     </w:p>
@@ -782,14 +662,8 @@
           <w:ilvl w:val="0"/>
           <w:numId w:val="35"/>
         </w:numPr>
-        <w:rPr>
-          <w:lang w:val="en-IL"/>
-        </w:rPr>
-      </w:pPr>
-      <w:r>
-        <w:rPr>
-          <w:lang w:val="en-IL"/>
-        </w:rPr>
+      </w:pPr>
+      <w:r>
         <w:t>Cannot create, edit, or view configuration items</w:t>
       </w:r>
     </w:p>
@@ -799,14 +673,8 @@
           <w:ilvl w:val="0"/>
           <w:numId w:val="35"/>
         </w:numPr>
-        <w:rPr>
-          <w:lang w:val="en-IL"/>
-        </w:rPr>
-      </w:pPr>
-      <w:r>
-        <w:rPr>
-          <w:lang w:val="en-IL"/>
-        </w:rPr>
+      </w:pPr>
+      <w:r>
         <w:t>Cannot create or edit namespaces</w:t>
       </w:r>
     </w:p>
@@ -819,13 +687,9 @@
         <w:rPr>
           <w:b/>
           <w:bCs/>
-          <w:lang w:val="en-IL"/>
         </w:rPr>
       </w:pPr>
       <w:r>
-        <w:rPr>
-          <w:lang w:val="en-IL"/>
-        </w:rPr>
         <w:t>Editing functionality is not exposed in the UI</w:t>
       </w:r>
     </w:p>
@@ -834,54 +698,28 @@
         <w:rPr>
           <w:b/>
           <w:bCs/>
-          <w:lang w:val="en-IL"/>
         </w:rPr>
       </w:pPr>
       <w:r>
         <w:rPr>
           <w:b/>
           <w:bCs/>
-          <w:lang w:val="en-IL"/>
         </w:rPr>
         <w:t>Namespace Permissions</w:t>
       </w:r>
     </w:p>
     <w:p>
-      <w:pPr>
-        <w:rPr>
-          <w:lang w:val="en-IL"/>
-        </w:rPr>
-      </w:pPr>
-      <w:r>
-        <w:rPr>
-          <w:lang w:val="en-IL"/>
-        </w:rPr>
+      <w:r>
         <w:t>Permissions may be granted directly on a Namespace or inherited from an ancestor Namespace.</w:t>
       </w:r>
     </w:p>
     <w:p>
-      <w:pPr>
-        <w:rPr>
-          <w:lang w:val="en-IL"/>
-        </w:rPr>
-      </w:pPr>
-      <w:r>
-        <w:rPr>
-          <w:lang w:val="en-IL"/>
-        </w:rPr>
+      <w:r>
         <w:t>Effective permissions are determined by evaluating both direct and inherited permissions.</w:t>
       </w:r>
     </w:p>
     <w:p>
-      <w:pPr>
-        <w:rPr>
-          <w:lang w:val="en-IL"/>
-        </w:rPr>
-      </w:pPr>
-      <w:r>
-        <w:rPr>
-          <w:lang w:val="en-IL"/>
-        </w:rPr>
+      <w:r>
         <w:t>Use Permission</w:t>
       </w:r>
     </w:p>
@@ -891,14 +729,8 @@
           <w:ilvl w:val="0"/>
           <w:numId w:val="40"/>
         </w:numPr>
-        <w:rPr>
-          <w:lang w:val="en-IL"/>
-        </w:rPr>
-      </w:pPr>
-      <w:r>
-        <w:rPr>
-          <w:lang w:val="en-IL"/>
-        </w:rPr>
+      </w:pPr>
+      <w:r>
         <w:t>Allows execution or usage of resources contained within the Namespace.</w:t>
       </w:r>
     </w:p>
@@ -908,14 +740,8 @@
           <w:ilvl w:val="0"/>
           <w:numId w:val="40"/>
         </w:numPr>
-        <w:rPr>
-          <w:lang w:val="en-IL"/>
-        </w:rPr>
-      </w:pPr>
-      <w:r>
-        <w:rPr>
-          <w:lang w:val="en-IL"/>
-        </w:rPr>
+      </w:pPr>
+      <w:r>
         <w:t>A user without effective Use permission:</w:t>
       </w:r>
     </w:p>
@@ -925,14 +751,8 @@
           <w:ilvl w:val="1"/>
           <w:numId w:val="40"/>
         </w:numPr>
-        <w:rPr>
-          <w:lang w:val="en-IL"/>
-        </w:rPr>
-      </w:pPr>
-      <w:r>
-        <w:rPr>
-          <w:lang w:val="en-IL"/>
-        </w:rPr>
+      </w:pPr>
+      <w:r>
         <w:t>Cannot execute scripts under the Namespace.</w:t>
       </w:r>
     </w:p>
@@ -942,39 +762,19 @@
           <w:ilvl w:val="1"/>
           <w:numId w:val="40"/>
         </w:numPr>
-        <w:rPr>
-          <w:lang w:val="en-IL"/>
-        </w:rPr>
-      </w:pPr>
-      <w:r>
-        <w:rPr>
-          <w:lang w:val="en-IL"/>
-        </w:rPr>
+      </w:pPr>
+      <w:r>
         <w:t xml:space="preserve">Cannot reference </w:t>
       </w:r>
       <w:r>
-        <w:rPr>
-          <w:lang w:val="en-IL"/>
-        </w:rPr>
         <w:t xml:space="preserve">resources </w:t>
       </w:r>
       <w:r>
-        <w:rPr>
-          <w:lang w:val="en-IL"/>
-        </w:rPr>
         <w:t>under the Namespace as dependencies.</w:t>
       </w:r>
     </w:p>
     <w:p>
-      <w:pPr>
-        <w:rPr>
-          <w:lang w:val="en-IL"/>
-        </w:rPr>
-      </w:pPr>
-      <w:r>
-        <w:rPr>
-          <w:lang w:val="en-IL"/>
-        </w:rPr>
+      <w:r>
         <w:t>Edit Permission</w:t>
       </w:r>
     </w:p>
@@ -984,14 +784,8 @@
           <w:ilvl w:val="0"/>
           <w:numId w:val="41"/>
         </w:numPr>
-        <w:rPr>
-          <w:lang w:val="en-IL"/>
-        </w:rPr>
-      </w:pPr>
-      <w:r>
-        <w:rPr>
-          <w:lang w:val="en-IL"/>
-        </w:rPr>
+      </w:pPr>
+      <w:r>
         <w:t>Allows modification of resources contained within the Namespace.</w:t>
       </w:r>
     </w:p>
@@ -1001,14 +795,8 @@
           <w:ilvl w:val="0"/>
           <w:numId w:val="41"/>
         </w:numPr>
-        <w:rPr>
-          <w:lang w:val="en-IL"/>
-        </w:rPr>
-      </w:pPr>
-      <w:r>
-        <w:rPr>
-          <w:lang w:val="en-IL"/>
-        </w:rPr>
+      </w:pPr>
+      <w:r>
         <w:t>Allows viewing the internal structure (e.g., source code) of resources under the Namespace.</w:t>
       </w:r>
     </w:p>
@@ -1017,14 +805,12 @@
         <w:rPr>
           <w:b/>
           <w:bCs/>
-          <w:lang w:val="en-IL"/>
         </w:rPr>
       </w:pPr>
       <w:r>
         <w:rPr>
           <w:b/>
           <w:bCs/>
-          <w:lang w:val="en-IL"/>
         </w:rPr>
         <w:lastRenderedPageBreak/>
         <w:t>Dependency Rules</w:t>
@@ -1040,13 +826,9 @@
         <w:rPr>
           <w:b/>
           <w:bCs/>
-          <w:lang w:val="en-IL"/>
         </w:rPr>
       </w:pPr>
       <w:r>
-        <w:rPr>
-          <w:lang w:val="en-IL"/>
-        </w:rPr>
         <w:t>A resource may reference another resource located in a different Namespace path.</w:t>
       </w:r>
     </w:p>
@@ -1060,25 +842,15 @@
         <w:rPr>
           <w:b/>
           <w:bCs/>
-          <w:lang w:val="en-IL"/>
         </w:rPr>
       </w:pPr>
       <w:r>
-        <w:rPr>
-          <w:lang w:val="en-IL"/>
-        </w:rPr>
         <w:t xml:space="preserve"> Permissions granted on a Namespace apply to all contained resources and sub-namespaces, unless explicitly overridden by a </w:t>
       </w:r>
       <w:r>
-        <w:rPr>
-          <w:lang w:val="en-IL"/>
-        </w:rPr>
         <w:t>sub-namespace</w:t>
       </w:r>
       <w:r>
-        <w:rPr>
-          <w:lang w:val="en-IL"/>
-        </w:rPr>
         <w:t>.</w:t>
       </w:r>
     </w:p>
@@ -1092,13 +864,9 @@
         <w:rPr>
           <w:b/>
           <w:bCs/>
-          <w:lang w:val="en-IL"/>
         </w:rPr>
       </w:pPr>
       <w:r>
-        <w:rPr>
-          <w:lang w:val="en-IL"/>
-        </w:rPr>
         <w:t xml:space="preserve"> To edit a referencing resource, a user must hold the effective Use permission on the referenced resource (granted directly or inherited from an ancestor Namespace).</w:t>
       </w:r>
     </w:p>
@@ -1112,13 +880,9 @@
         <w:rPr>
           <w:b/>
           <w:bCs/>
-          <w:lang w:val="en-IL"/>
         </w:rPr>
       </w:pPr>
       <w:r>
-        <w:rPr>
-          <w:lang w:val="en-IL"/>
-        </w:rPr>
         <w:t>A user may execute or use a resource even if they do not hold permissions on its internal dependencies, provided execution is encapsulated and does not expose restricted data.</w:t>
       </w:r>
     </w:p>
@@ -1132,25 +896,15 @@
         <w:rPr>
           <w:b/>
           <w:bCs/>
-          <w:lang w:val="en-IL"/>
         </w:rPr>
       </w:pPr>
       <w:r>
-        <w:rPr>
-          <w:lang w:val="en-IL"/>
-        </w:rPr>
         <w:t xml:space="preserve">A Namespace may be marked as public, making it </w:t>
       </w:r>
       <w:r>
-        <w:rPr>
-          <w:lang w:val="en-IL"/>
-        </w:rPr>
         <w:t>usable and editable</w:t>
       </w:r>
       <w:r>
-        <w:rPr>
-          <w:lang w:val="en-IL"/>
-        </w:rPr>
         <w:t xml:space="preserve"> to all users.</w:t>
       </w:r>
     </w:p>
@@ -1164,32 +918,16 @@
         <w:rPr>
           <w:b/>
           <w:bCs/>
-          <w:lang w:val="en-IL"/>
         </w:rPr>
       </w:pPr>
       <w:r>
-        <w:rPr>
-          <w:lang w:val="en-IL"/>
-        </w:rPr>
         <w:t xml:space="preserve"> When a Script or Config Item is created, the system creates a dedicated resource Namespace for it</w:t>
       </w:r>
       <w:r>
-        <w:rPr>
-          <w:lang w:val="en-IL"/>
-        </w:rPr>
         <w:t xml:space="preserve">, which </w:t>
       </w:r>
       <w:r>
-        <w:rPr>
-          <w:lang w:val="en-IL"/>
-        </w:rPr>
-        <w:t xml:space="preserve">is </w:t>
-      </w:r>
-      <w:r>
-        <w:rPr>
-          <w:lang w:val="en-IL"/>
-        </w:rPr>
-        <w:t>private by default and grants Use and Edit permissions only to its Creator.</w:t>
+        <w:t>is private by default and grants Use and Edit permissions only to its Creator.</w:t>
       </w:r>
     </w:p>
     <w:p>
@@ -1202,13 +940,9 @@
         <w:rPr>
           <w:b/>
           <w:bCs/>
-          <w:lang w:val="en-IL"/>
         </w:rPr>
       </w:pPr>
       <w:r>
-        <w:rPr>
-          <w:lang w:val="en-IL"/>
-        </w:rPr>
         <w:t xml:space="preserve"> Organizational (manually created) Namespaces are public by default, unless explicitly restricted.</w:t>
       </w:r>
     </w:p>
@@ -1217,28 +951,18 @@
         <w:rPr>
           <w:b/>
           <w:bCs/>
-          <w:lang w:val="en-IL"/>
         </w:rPr>
       </w:pPr>
       <w:r>
         <w:rPr>
           <w:b/>
           <w:bCs/>
-          <w:lang w:val="en-IL"/>
         </w:rPr>
         <w:t>Permission Delegation</w:t>
       </w:r>
     </w:p>
     <w:p>
-      <w:pPr>
-        <w:rPr>
-          <w:lang w:val="en-IL"/>
-        </w:rPr>
-      </w:pPr>
-      <w:r>
-        <w:rPr>
-          <w:lang w:val="en-IL"/>
-        </w:rPr>
+      <w:r>
         <w:t>For any Namespace:</w:t>
       </w:r>
     </w:p>
@@ -1248,27 +972,13 @@
           <w:ilvl w:val="0"/>
           <w:numId w:val="27"/>
         </w:numPr>
-        <w:rPr>
-          <w:lang w:val="en-IL"/>
-        </w:rPr>
-      </w:pPr>
-      <w:r>
-        <w:rPr>
-          <w:lang w:val="en-IL"/>
-        </w:rPr>
+      </w:pPr>
+      <w:r>
         <w:t>Any user who holds a specific permission on a Namespace may grant or revoke that same permission to or from other users for that Namespace.</w:t>
       </w:r>
     </w:p>
     <w:p>
-      <w:pPr>
-        <w:rPr>
-          <w:lang w:val="en-IL"/>
-        </w:rPr>
-      </w:pPr>
-      <w:r>
-        <w:rPr>
-          <w:lang w:val="en-IL"/>
-        </w:rPr>
+      <w:r>
         <w:t>Rules</w:t>
       </w:r>
     </w:p>
@@ -1278,14 +988,8 @@
           <w:ilvl w:val="0"/>
           <w:numId w:val="28"/>
         </w:numPr>
-        <w:rPr>
-          <w:lang w:val="en-IL"/>
-        </w:rPr>
-      </w:pPr>
-      <w:r>
-        <w:rPr>
-          <w:lang w:val="en-IL"/>
-        </w:rPr>
+      </w:pPr>
+      <w:r>
         <w:t>A user may only delegate permissions they currently possess.</w:t>
       </w:r>
     </w:p>
@@ -1295,14 +999,8 @@
           <w:ilvl w:val="0"/>
           <w:numId w:val="28"/>
         </w:numPr>
-        <w:rPr>
-          <w:lang w:val="en-IL"/>
-        </w:rPr>
-      </w:pPr>
-      <w:r>
-        <w:rPr>
-          <w:lang w:val="en-IL"/>
-        </w:rPr>
+      </w:pPr>
+      <w:r>
         <w:t>The Creator’s permissions cannot be revoked.</w:t>
       </w:r>
     </w:p>
@@ -1312,14 +1010,8 @@
           <w:ilvl w:val="0"/>
           <w:numId w:val="28"/>
         </w:numPr>
-        <w:rPr>
-          <w:lang w:val="en-IL"/>
-        </w:rPr>
-      </w:pPr>
-      <w:r>
-        <w:rPr>
-          <w:lang w:val="en-IL"/>
-        </w:rPr>
+      </w:pPr>
+      <w:r>
         <w:t>A user cannot grant themselves a permission they do not already hold.</w:t>
       </w:r>
     </w:p>
@@ -1329,14 +1021,8 @@
           <w:ilvl w:val="0"/>
           <w:numId w:val="28"/>
         </w:numPr>
-        <w:rPr>
-          <w:lang w:val="en-IL"/>
-        </w:rPr>
-      </w:pPr>
-      <w:r>
-        <w:rPr>
-          <w:lang w:val="en-IL"/>
-        </w:rPr>
+      </w:pPr>
+      <w:r>
         <w:t>All permission changes are validated and enforced at the backend level.</w:t>
       </w:r>
     </w:p>
@@ -1345,7 +1031,6 @@
         <w:rPr>
           <w:b/>
           <w:bCs/>
-          <w:lang w:val="en-IL"/>
         </w:rPr>
       </w:pPr>
     </w:p>
@@ -1533,6 +1218,17 @@
       </w:pPr>
       <w:r>
         <w:t>Runtime isolation and baseline security</w:t>
+      </w:r>
+    </w:p>
+    <w:p>
+      <w:pPr>
+        <w:numPr>
+          <w:ilvl w:val="0"/>
+          <w:numId w:val="15"/>
+        </w:numPr>
+      </w:pPr>
+      <w:r>
+        <w:t>Basic user auth and roles</w:t>
       </w:r>
     </w:p>
     <w:p>
@@ -8695,6 +8391,7 @@
   <w:style w:type="character" w:default="1" w:styleId="DefaultParagraphFont">
     <w:name w:val="Default Paragraph Font"/>
     <w:uiPriority w:val="1"/>
+    <w:semiHidden/>
     <w:unhideWhenUsed/>
   </w:style>
   <w:style w:type="table" w:default="1" w:styleId="TableNormal">
@@ -9020,7 +8717,7 @@
     <w:rPr>
       <w:rFonts w:ascii="Times New Roman" w:eastAsia="Times New Roman" w:hAnsi="Times New Roman" w:cs="Times New Roman"/>
       <w:kern w:val="0"/>
-      <w:lang w:val="en-IL" w:eastAsia="en-IL"/>
+      <w:lang w:eastAsia="en-IL"/>
       <w14:ligatures w14:val="none"/>
     </w:rPr>
   </w:style>

</xml_diff>

<commit_message>
Add TDD and update PRD
Add a new Technical Design Document and update the Product Requirements Document with the latest requirements and specifications.
</commit_message>
<xml_diff>
--- a/Specifications/PRD.docx
+++ b/Specifications/PRD.docx
@@ -1,6 +1,6 @@
 
 <file path=word/document.xml><?xml version="1.0" encoding="utf-8"?>
-<w:document xmlns:wpc="http://schemas.microsoft.com/office/word/2010/wordprocessingCanvas" xmlns:cx="http://schemas.microsoft.com/office/drawing/2014/chartex" xmlns:cx1="http://schemas.microsoft.com/office/drawing/2015/9/8/chartex" xmlns:cx2="http://schemas.microsoft.com/office/drawing/2015/10/21/chartex" xmlns:cx3="http://schemas.microsoft.com/office/drawing/2016/5/9/chartex" xmlns:cx4="http://schemas.microsoft.com/office/drawing/2016/5/10/chartex" xmlns:cx5="http://schemas.microsoft.com/office/drawing/2016/5/11/chartex" xmlns:cx6="http://schemas.microsoft.com/office/drawing/2016/5/12/chartex" xmlns:cx7="http://schemas.microsoft.com/office/drawing/2016/5/13/chartex" xmlns:cx8="http://schemas.microsoft.com/office/drawing/2016/5/14/chartex" xmlns:mc="http://schemas.openxmlformats.org/markup-compatibility/2006" xmlns:aink="http://schemas.microsoft.com/office/drawing/2016/ink" xmlns:am3d="http://schemas.microsoft.com/office/drawing/2017/model3d" xmlns:o="urn:schemas-microsoft-com:office:office" xmlns:oel="http://schemas.microsoft.com/office/2019/extlst" xmlns:r="http://schemas.openxmlformats.org/officeDocument/2006/relationships" xmlns:m="http://schemas.openxmlformats.org/officeDocument/2006/math" xmlns:v="urn:schemas-microsoft-com:vml" xmlns:wp14="http://schemas.microsoft.com/office/word/2010/wordprocessingDrawing" xmlns:wp="http://schemas.openxmlformats.org/drawingml/2006/wordprocessingDrawing" xmlns:w10="urn:schemas-microsoft-com:office:word" xmlns:w="http://schemas.openxmlformats.org/wordprocessingml/2006/main" xmlns:w14="http://schemas.microsoft.com/office/word/2010/wordml" xmlns:w15="http://schemas.microsoft.com/office/word/2012/wordml" xmlns:w16cex="http://schemas.microsoft.com/office/word/2018/wordml/cex" xmlns:w16cid="http://schemas.microsoft.com/office/word/2016/wordml/cid" xmlns:w16="http://schemas.microsoft.com/office/word/2018/wordml" xmlns:w16du="http://schemas.microsoft.com/office/word/2023/wordml/word16du" xmlns:w16sdtdh="http://schemas.microsoft.com/office/word/2020/wordml/sdtdatahash" xmlns:w16sdtfl="http://schemas.microsoft.com/office/word/2024/wordml/sdtformatlock" xmlns:w16se="http://schemas.microsoft.com/office/word/2015/wordml/symex" xmlns:wpg="http://schemas.microsoft.com/office/word/2010/wordprocessingGroup" xmlns:wpi="http://schemas.microsoft.com/office/word/2010/wordprocessingInk" xmlns:wne="http://schemas.microsoft.com/office/word/2006/wordml" xmlns:wps="http://schemas.microsoft.com/office/word/2010/wordprocessingShape" mc:Ignorable="w14 w15 w16se w16cid w16 w16cex w16sdtdh w16sdtfl w16du wp14">
+<w:document xmlns:wpc="http://schemas.microsoft.com/office/word/2010/wordprocessingCanvas" xmlns:cx="http://schemas.microsoft.com/office/drawing/2014/chartex" xmlns:cx1="http://schemas.microsoft.com/office/drawing/2015/9/8/chartex" xmlns:cx2="http://schemas.microsoft.com/office/drawing/2015/10/21/chartex" xmlns:cx3="http://schemas.microsoft.com/office/drawing/2016/5/9/chartex" xmlns:cx4="http://schemas.microsoft.com/office/drawing/2016/5/10/chartex" xmlns:cx5="http://schemas.microsoft.com/office/drawing/2016/5/11/chartex" xmlns:cx6="http://schemas.microsoft.com/office/drawing/2016/5/12/chartex" xmlns:cx7="http://schemas.microsoft.com/office/drawing/2016/5/13/chartex" xmlns:cx8="http://schemas.microsoft.com/office/drawing/2016/5/14/chartex" xmlns:mc="http://schemas.openxmlformats.org/markup-compatibility/2006" xmlns:aink="http://schemas.microsoft.com/office/drawing/2016/ink" xmlns:am3d="http://schemas.microsoft.com/office/drawing/2017/model3d" xmlns:o="urn:schemas-microsoft-com:office:office" xmlns:oel="http://schemas.microsoft.com/office/2019/extlst" xmlns:r="http://schemas.openxmlformats.org/officeDocument/2006/relationships" xmlns:m="http://schemas.openxmlformats.org/officeDocument/2006/math" xmlns:v="urn:schemas-microsoft-com:vml" xmlns:wp14="http://schemas.microsoft.com/office/word/2010/wordprocessingDrawing" xmlns:wp="http://schemas.openxmlformats.org/drawingml/2006/wordprocessingDrawing" xmlns:w10="urn:schemas-microsoft-com:office:word" xmlns:w="http://schemas.openxmlformats.org/wordprocessingml/2006/main" xmlns:w14="http://schemas.microsoft.com/office/word/2010/wordml" xmlns:w15="http://schemas.microsoft.com/office/word/2012/wordml" xmlns:w16cei="http://schemas.microsoft.com/office/word/2026/wordml/cei" xmlns:w16cex="http://schemas.microsoft.com/office/word/2018/wordml/cex" xmlns:w16cid="http://schemas.microsoft.com/office/word/2016/wordml/cid" xmlns:w16="http://schemas.microsoft.com/office/word/2018/wordml" xmlns:w16du="http://schemas.microsoft.com/office/word/2023/wordml/word16du" xmlns:w16sdtdh="http://schemas.microsoft.com/office/word/2020/wordml/sdtdatahash" xmlns:w16sdtfl="http://schemas.microsoft.com/office/word/2024/wordml/sdtformatlock" xmlns:w16se="http://schemas.microsoft.com/office/word/2015/wordml/symex" xmlns:wpg="http://schemas.microsoft.com/office/word/2010/wordprocessingGroup" xmlns:wpi="http://schemas.microsoft.com/office/word/2010/wordprocessingInk" xmlns:wne="http://schemas.microsoft.com/office/word/2006/wordml" xmlns:wps="http://schemas.microsoft.com/office/word/2010/wordprocessingShape" mc:Ignorable="w14 w15 w16se w16cid w16 w16cex w16sdtdh w16sdtfl w16du wp14">
   <w:body>
     <w:p>
       <w:pPr>
@@ -1228,7 +1228,10 @@
         </w:numPr>
       </w:pPr>
       <w:r>
-        <w:t>Basic user auth and roles</w:t>
+        <w:t>Basic user auth</w:t>
+      </w:r>
+      <w:r>
+        <w:t>entication</w:t>
       </w:r>
     </w:p>
     <w:p>
@@ -1427,7 +1430,7 @@
 </file>
 
 <file path=word/numbering.xml><?xml version="1.0" encoding="utf-8"?>
-<w:numbering xmlns:wpc="http://schemas.microsoft.com/office/word/2010/wordprocessingCanvas" xmlns:cx="http://schemas.microsoft.com/office/drawing/2014/chartex" xmlns:cx1="http://schemas.microsoft.com/office/drawing/2015/9/8/chartex" xmlns:cx2="http://schemas.microsoft.com/office/drawing/2015/10/21/chartex" xmlns:cx3="http://schemas.microsoft.com/office/drawing/2016/5/9/chartex" xmlns:cx4="http://schemas.microsoft.com/office/drawing/2016/5/10/chartex" xmlns:cx5="http://schemas.microsoft.com/office/drawing/2016/5/11/chartex" xmlns:cx6="http://schemas.microsoft.com/office/drawing/2016/5/12/chartex" xmlns:cx7="http://schemas.microsoft.com/office/drawing/2016/5/13/chartex" xmlns:cx8="http://schemas.microsoft.com/office/drawing/2016/5/14/chartex" xmlns:mc="http://schemas.openxmlformats.org/markup-compatibility/2006" xmlns:aink="http://schemas.microsoft.com/office/drawing/2016/ink" xmlns:am3d="http://schemas.microsoft.com/office/drawing/2017/model3d" xmlns:o="urn:schemas-microsoft-com:office:office" xmlns:oel="http://schemas.microsoft.com/office/2019/extlst" xmlns:r="http://schemas.openxmlformats.org/officeDocument/2006/relationships" xmlns:m="http://schemas.openxmlformats.org/officeDocument/2006/math" xmlns:v="urn:schemas-microsoft-com:vml" xmlns:wp14="http://schemas.microsoft.com/office/word/2010/wordprocessingDrawing" xmlns:wp="http://schemas.openxmlformats.org/drawingml/2006/wordprocessingDrawing" xmlns:w10="urn:schemas-microsoft-com:office:word" xmlns:w="http://schemas.openxmlformats.org/wordprocessingml/2006/main" xmlns:w14="http://schemas.microsoft.com/office/word/2010/wordml" xmlns:w15="http://schemas.microsoft.com/office/word/2012/wordml" xmlns:w16cex="http://schemas.microsoft.com/office/word/2018/wordml/cex" xmlns:w16cid="http://schemas.microsoft.com/office/word/2016/wordml/cid" xmlns:w16="http://schemas.microsoft.com/office/word/2018/wordml" xmlns:w16du="http://schemas.microsoft.com/office/word/2023/wordml/word16du" xmlns:w16sdtdh="http://schemas.microsoft.com/office/word/2020/wordml/sdtdatahash" xmlns:w16sdtfl="http://schemas.microsoft.com/office/word/2024/wordml/sdtformatlock" xmlns:w16se="http://schemas.microsoft.com/office/word/2015/wordml/symex" xmlns:wpg="http://schemas.microsoft.com/office/word/2010/wordprocessingGroup" xmlns:wpi="http://schemas.microsoft.com/office/word/2010/wordprocessingInk" xmlns:wne="http://schemas.microsoft.com/office/word/2006/wordml" xmlns:wps="http://schemas.microsoft.com/office/word/2010/wordprocessingShape" mc:Ignorable="w14 w15 w16se w16cid w16 w16cex w16sdtdh w16sdtfl w16du wp14">
+<w:numbering xmlns:wpc="http://schemas.microsoft.com/office/word/2010/wordprocessingCanvas" xmlns:cx="http://schemas.microsoft.com/office/drawing/2014/chartex" xmlns:cx1="http://schemas.microsoft.com/office/drawing/2015/9/8/chartex" xmlns:cx2="http://schemas.microsoft.com/office/drawing/2015/10/21/chartex" xmlns:cx3="http://schemas.microsoft.com/office/drawing/2016/5/9/chartex" xmlns:cx4="http://schemas.microsoft.com/office/drawing/2016/5/10/chartex" xmlns:cx5="http://schemas.microsoft.com/office/drawing/2016/5/11/chartex" xmlns:cx6="http://schemas.microsoft.com/office/drawing/2016/5/12/chartex" xmlns:cx7="http://schemas.microsoft.com/office/drawing/2016/5/13/chartex" xmlns:cx8="http://schemas.microsoft.com/office/drawing/2016/5/14/chartex" xmlns:mc="http://schemas.openxmlformats.org/markup-compatibility/2006" xmlns:aink="http://schemas.microsoft.com/office/drawing/2016/ink" xmlns:am3d="http://schemas.microsoft.com/office/drawing/2017/model3d" xmlns:o="urn:schemas-microsoft-com:office:office" xmlns:oel="http://schemas.microsoft.com/office/2019/extlst" xmlns:r="http://schemas.openxmlformats.org/officeDocument/2006/relationships" xmlns:m="http://schemas.openxmlformats.org/officeDocument/2006/math" xmlns:v="urn:schemas-microsoft-com:vml" xmlns:wp14="http://schemas.microsoft.com/office/word/2010/wordprocessingDrawing" xmlns:wp="http://schemas.openxmlformats.org/drawingml/2006/wordprocessingDrawing" xmlns:w10="urn:schemas-microsoft-com:office:word" xmlns:w="http://schemas.openxmlformats.org/wordprocessingml/2006/main" xmlns:w14="http://schemas.microsoft.com/office/word/2010/wordml" xmlns:w15="http://schemas.microsoft.com/office/word/2012/wordml" xmlns:w16cei="http://schemas.microsoft.com/office/word/2026/wordml/cei" xmlns:w16cex="http://schemas.microsoft.com/office/word/2018/wordml/cex" xmlns:w16cid="http://schemas.microsoft.com/office/word/2016/wordml/cid" xmlns:w16="http://schemas.microsoft.com/office/word/2018/wordml" xmlns:w16du="http://schemas.microsoft.com/office/word/2023/wordml/word16du" xmlns:w16sdtdh="http://schemas.microsoft.com/office/word/2020/wordml/sdtdatahash" xmlns:w16sdtfl="http://schemas.microsoft.com/office/word/2024/wordml/sdtformatlock" xmlns:w16se="http://schemas.microsoft.com/office/word/2015/wordml/symex" xmlns:wpg="http://schemas.microsoft.com/office/word/2010/wordprocessingGroup" xmlns:wpi="http://schemas.microsoft.com/office/word/2010/wordprocessingInk" xmlns:wne="http://schemas.microsoft.com/office/word/2006/wordml" xmlns:wps="http://schemas.microsoft.com/office/word/2010/wordprocessingShape" mc:Ignorable="w14 w15 w16se w16cid w16 w16cex w16sdtdh w16sdtfl w16du wp14">
   <w:abstractNum w:abstractNumId="0" w15:restartNumberingAfterBreak="0">
     <w:nsid w:val="01607E55"/>
     <w:multiLevelType w:val="hybridMultilevel"/>

</xml_diff>

<commit_message>
Rename Run status "completed" to "succeeded", add Run timestamps
Aligns the RunStatus enum with the shared types and gives runs their
own createdAt/updatedAt columns, backfilled for the existing row.
</commit_message>
<xml_diff>
--- a/Specifications/PRD.docx
+++ b/Specifications/PRD.docx
@@ -1206,7 +1206,19 @@
         </w:numPr>
       </w:pPr>
       <w:r>
-        <w:t>Basic parallel execution</w:t>
+        <w:t>Runtime isolation</w:t>
+      </w:r>
+      <w:r>
+        <w:t>,</w:t>
+      </w:r>
+      <w:r>
+        <w:t xml:space="preserve"> </w:t>
+      </w:r>
+      <w:r>
+        <w:t>parallel execution</w:t>
+      </w:r>
+      <w:r>
+        <w:t xml:space="preserve"> and baseline security</w:t>
       </w:r>
     </w:p>
     <w:p>
@@ -1217,7 +1229,10 @@
         </w:numPr>
       </w:pPr>
       <w:r>
-        <w:t>Runtime isolation and baseline security</w:t>
+        <w:t>Basic user auth</w:t>
+      </w:r>
+      <w:r>
+        <w:t>entication</w:t>
       </w:r>
     </w:p>
     <w:p>
@@ -1228,10 +1243,7 @@
         </w:numPr>
       </w:pPr>
       <w:r>
-        <w:t>Basic user auth</w:t>
-      </w:r>
-      <w:r>
-        <w:t>entication</w:t>
+        <w:t>Config Items (constants / JSON objects)</w:t>
       </w:r>
     </w:p>
     <w:p>
@@ -1278,7 +1290,7 @@
         </w:numPr>
       </w:pPr>
       <w:r>
-        <w:t>Config Items (constants / JSON objects)</w:t>
+        <w:t>Script-to-script calls</w:t>
       </w:r>
     </w:p>
     <w:p>
@@ -1289,7 +1301,7 @@
         </w:numPr>
       </w:pPr>
       <w:r>
-        <w:t>Script-to-script calls</w:t>
+        <w:t>Dependency validation</w:t>
       </w:r>
     </w:p>
     <w:p>
@@ -1300,7 +1312,7 @@
         </w:numPr>
       </w:pPr>
       <w:r>
-        <w:t>Dependency validation</w:t>
+        <w:t>Chained execution logs</w:t>
       </w:r>
     </w:p>
     <w:p>
@@ -1311,7 +1323,7 @@
         </w:numPr>
       </w:pPr>
       <w:r>
-        <w:t>Chained execution logs</w:t>
+        <w:t>Namespaces</w:t>
       </w:r>
     </w:p>
     <w:p>
@@ -1322,7 +1334,13 @@
         </w:numPr>
       </w:pPr>
       <w:r>
-        <w:t>Namespaces</w:t>
+        <w:t xml:space="preserve">Cloud </w:t>
+      </w:r>
+      <w:r>
+        <w:t>d</w:t>
+      </w:r>
+      <w:r>
+        <w:t>eployment</w:t>
       </w:r>
     </w:p>
     <w:p>

</xml_diff>